<commit_message>
fix(competitions): align Barber and Braiding fees with portal
Update Barber and Braiding naira entry fees across the public website and HEBS Lagos 2026 concept note to match the confirmed registration portal values.

Barber divisions now use ₦50,000, ₦50,000, ₦75,000 and ₦100,000. Braiding divisions use ₦50,000, ₦50,000 per team, ₦50,000 and ₦105,000.

Signature, Taste of Culture, Mic Drop, sponsor, vendor, ticket and prize figures remain unchanged.

Co-Authored-By: Claude Opus 5 (1M context) <noreply@anthropic.com>
</commit_message>
<xml_diff>
--- a/HEBS_Lagos_2026_Concept_Note.docx
+++ b/HEBS_Lagos_2026_Concept_Note.docx
@@ -6260,7 +6260,7 @@
                 <w:color w:val="2B2B2B"/>
                 <w:sz w:val="19"/>
               </w:rPr>
-              <w:t>$50 USD / ₦70,000 per competitor</w:t>
+              <w:t>$50 USD / ₦50,000 per competitor</w:t>
             </w:r>
           </w:p>
         </w:tc>
@@ -6302,7 +6302,7 @@
                 <w:color w:val="2B2B2B"/>
                 <w:sz w:val="19"/>
               </w:rPr>
-              <w:t>$50 USD / ₦70,000 per competitor</w:t>
+              <w:t>$50 USD / ₦50,000 per competitor</w:t>
             </w:r>
           </w:p>
         </w:tc>
@@ -6344,7 +6344,7 @@
                 <w:color w:val="2B2B2B"/>
                 <w:sz w:val="19"/>
               </w:rPr>
-              <w:t>$75 USD / ₦105,000 per competitor</w:t>
+              <w:t>$75 USD / ₦75,000 per competitor</w:t>
             </w:r>
           </w:p>
         </w:tc>
@@ -6386,7 +6386,7 @@
                 <w:color w:val="2B2B2B"/>
                 <w:sz w:val="19"/>
               </w:rPr>
-              <w:t xml:space="preserve">$100 USD / ₦140,000 </w:t>
+              <w:t xml:space="preserve">$100 USD / ₦100,000 </w:t>
             </w:r>
             <w:r>
               <w:rPr>
@@ -6529,7 +6529,7 @@
                 <w:color w:val="2B2B2B"/>
                 <w:sz w:val="19"/>
               </w:rPr>
-              <w:t>$50 USD / ₦70,000 per competitor</w:t>
+              <w:t>$50 USD / ₦50,000 per competitor</w:t>
             </w:r>
           </w:p>
         </w:tc>
@@ -6571,7 +6571,7 @@
                 <w:color w:val="2B2B2B"/>
                 <w:sz w:val="19"/>
               </w:rPr>
-              <w:t xml:space="preserve">$50 USD / ₦70,000 </w:t>
+              <w:t xml:space="preserve">$50 USD / ₦50,000 </w:t>
             </w:r>
             <w:r>
               <w:rPr>
@@ -6623,7 +6623,7 @@
                 <w:color w:val="2B2B2B"/>
                 <w:sz w:val="19"/>
               </w:rPr>
-              <w:t>$50 USD / ₦70,000 per competitor</w:t>
+              <w:t>$50 USD / ₦50,000 per competitor</w:t>
             </w:r>
           </w:p>
         </w:tc>

</xml_diff>

<commit_message>
docs(history): align HEBS fourth-edition track record
Record the separate sold-out United States edition held from 2–4 May 2026 and identify HEBS Lagos 2026 as the event's fourth edition and Lagos debut.

Align the website, assistant, social-proof copy, metadata and concept note while avoiding unsupported claims about the 2024 edition.

Competition fees, ticket prices, sponsor/vendor figures and prize amounts remain unchanged.

Co-Authored-By: Claude Opus 5 (1M context) <noreply@anthropic.com>
</commit_message>
<xml_diff>
--- a/HEBS_Lagos_2026_Concept_Note.docx
+++ b/HEBS_Lagos_2026_Concept_Note.docx
@@ -180,13 +180,18 @@
           <w:color w:val="2B2B2B"/>
           <w:sz w:val="21"/>
         </w:rPr>
-        <w:t xml:space="preserve"> that established its reputation internationally.</w:t>
+        <w:t xml:space="preserve"> that established its reputation internationally. Following those earlier United States editions, HEBS staged another sold-out edition from </w:t>
       </w:r>
-    </w:p>
-    <w:p>
-      <w:pPr>
-        <w:spacing w:before="0" w:after="160" w:line="276" w:lineRule="auto"/>
-      </w:pPr>
+      <w:r>
+        <w:rPr>
+          <w:rFonts w:ascii="Calibri" w:hAnsi="Calibri"/>
+          <w:b/>
+          <w:i w:val="0"/>
+          <w:color w:val="1A1A1A"/>
+          <w:sz w:val="21"/>
+        </w:rPr>
+        <w:t xml:space="preserve">2–4 May 2026</w:t>
+      </w:r>
       <w:r>
         <w:rPr>
           <w:rFonts w:ascii="Calibri" w:hAnsi="Calibri"/>
@@ -195,7 +200,22 @@
           <w:color w:val="2B2B2B"/>
           <w:sz w:val="21"/>
         </w:rPr>
-        <w:t xml:space="preserve">In 2026 the summit comes home. </w:t>
+        <w:t xml:space="preserve">.</w:t>
+      </w:r>
+    </w:p>
+    <w:p>
+      <w:pPr>
+        <w:spacing w:before="0" w:after="160" w:line="276" w:lineRule="auto"/>
+      </w:pPr>
+      <w:r>
+        <w:rPr>
+          <w:rFonts w:ascii="Calibri" w:hAnsi="Calibri"/>
+          <w:b w:val="0"/>
+          <w:i w:val="0"/>
+          <w:color w:val="2B2B2B"/>
+          <w:sz w:val="21"/>
+        </w:rPr>
+        <w:t xml:space="preserve">In October 2026 the summit comes home. </w:t>
       </w:r>
       <w:r>
         <w:rPr>
@@ -215,7 +235,7 @@
           <w:color w:val="2B2B2B"/>
           <w:sz w:val="21"/>
         </w:rPr>
-        <w:t xml:space="preserve"> is the inaugural Nigerian edition: three days of education, competition, exhibition, and cultural programming, hosted at two venues on the Lekki-Epe corridor of Lagos.</w:t>
+        <w:t xml:space="preserve"> will mark the event’s fourth edition and its Lagos debut: three days of education, competition, exhibition, and cultural programming, hosted at two venues on the Lekki-Epe corridor of Lagos.</w:t>
       </w:r>
     </w:p>
     <w:p>

</xml_diff>